<commit_message>
Render TAD Mermaid diagrams to real images and embed in docs
- Render the two Technical Architecture diagrams (system-context flow, OTP-login
  sequence) to PNG via mermaid-cli; store editable .mmd sources under
  docs/compliance/diagrams/.
- Replace the raw ```mermaid code blocks in 02-Technical-Architecture-Document.md
  with the rendered images so they appear as real figures everywhere (GitHub,
  raw view, and the generated Word .docx now embeds them in word/media/).

Co-Authored-By: Claude Opus 4.8 <noreply@anthropic.com>
</commit_message>
<xml_diff>
--- a/docs/compliance/02-Technical-Architecture-Document.docx
+++ b/docs/compliance/02-Technical-Architecture-Document.docx
@@ -28,7 +28,7 @@
         </w:p>
       </w:sdtContent>
     </w:sdt>
-    <w:bookmarkStart w:id="60" w:name="Xa47d83bdace7056ef88396d24c9315bc986ffb5"/>
+    <w:bookmarkStart w:id="66" w:name="Xa47d83bdace7056ef88396d24c9315bc986ffb5"/>
     <w:p>
       <w:pPr>
         <w:pStyle w:val="Heading1"/>
@@ -1685,7 +1685,7 @@
     </w:p>
     <w:bookmarkEnd w:id="17"/>
     <w:bookmarkEnd w:id="18"/>
-    <w:bookmarkStart w:id="22" w:name="architecture-overview"/>
+    <w:bookmarkStart w:id="25" w:name="architecture-overview"/>
     <w:p>
       <w:pPr>
         <w:pStyle w:val="Heading2"/>
@@ -2391,7 +2391,7 @@
       </w:r>
     </w:p>
     <w:bookmarkEnd w:id="20"/>
-    <w:bookmarkStart w:id="21" w:name="X016b371957973eeab00a0adb5b04f570ff4fb1d"/>
+    <w:bookmarkStart w:id="24" w:name="X016b371957973eeab00a0adb5b04f570ff4fb1d"/>
     <w:p>
       <w:pPr>
         <w:pStyle w:val="Heading3"/>
@@ -2402,268 +2402,91 @@
     </w:p>
     <w:p>
       <w:pPr>
-        <w:pStyle w:val="SourceCode"/>
-      </w:pPr>
-      <w:r>
-        <w:rPr>
-          <w:rStyle w:val="VerbatimChar"/>
-        </w:rPr>
-        <w:t xml:space="preserve">flowchart TB</w:t>
-      </w:r>
-      <w:r>
-        <w:br/>
-      </w:r>
-      <w:r>
-        <w:rPr>
-          <w:rStyle w:val="VerbatimChar"/>
-        </w:rPr>
-        <w:t xml:space="preserve">  subgraph Client["Customer surfaces (untrusted device)"]</w:t>
-      </w:r>
-      <w:r>
-        <w:br/>
-      </w:r>
-      <w:r>
-        <w:rPr>
-          <w:rStyle w:val="VerbatimChar"/>
-        </w:rPr>
-        <w:t xml:space="preserve">    RN["React Native App\n(iOS/Android, RN 0.86)\nnav state machine + in-memory store"]</w:t>
-      </w:r>
-      <w:r>
-        <w:br/>
-      </w:r>
-      <w:r>
-        <w:rPr>
-          <w:rStyle w:val="VerbatimChar"/>
-        </w:rPr>
-        <w:t xml:space="preserve">    WEB["Marketing Website\n(static + website-next)\nlead capture + voice widget"]</w:t>
-      </w:r>
-      <w:r>
-        <w:br/>
-      </w:r>
-      <w:r>
-        <w:rPr>
-          <w:rStyle w:val="VerbatimChar"/>
-        </w:rPr>
-        <w:t xml:space="preserve">  end</w:t>
-      </w:r>
-      <w:r>
-        <w:br/>
-      </w:r>
-      <w:r>
-        <w:br/>
-      </w:r>
-      <w:r>
-        <w:rPr>
-          <w:rStyle w:val="VerbatimChar"/>
-        </w:rPr>
-        <w:t xml:space="preserve">  subgraph Internal["First-party (Render-hosted)"]</w:t>
-      </w:r>
-      <w:r>
-        <w:br/>
-      </w:r>
-      <w:r>
-        <w:rPr>
-          <w:rStyle w:val="VerbatimChar"/>
-        </w:rPr>
-        <w:t xml:space="preserve">    API["Backend API\nExpress + Prisma\nauth / funnel / KYC / tracking / admin"]</w:t>
-      </w:r>
-      <w:r>
-        <w:br/>
-      </w:r>
-      <w:r>
-        <w:rPr>
-          <w:rStyle w:val="VerbatimChar"/>
-        </w:rPr>
-        <w:t xml:space="preserve">    ADMIN["Admin Dashboard\nNext.js 14 + SWR"]</w:t>
-      </w:r>
-      <w:r>
-        <w:br/>
-      </w:r>
-      <w:r>
-        <w:rPr>
-          <w:rStyle w:val="VerbatimChar"/>
-        </w:rPr>
-        <w:t xml:space="preserve">    DB[("PostgreSQL\nsystem of record")]</w:t>
-      </w:r>
-      <w:r>
-        <w:br/>
-      </w:r>
-      <w:r>
-        <w:rPr>
-          <w:rStyle w:val="VerbatimChar"/>
-        </w:rPr>
-        <w:t xml:space="preserve">  end</w:t>
-      </w:r>
-      <w:r>
-        <w:br/>
-      </w:r>
-      <w:r>
-        <w:br/>
-      </w:r>
-      <w:r>
-        <w:rPr>
-          <w:rStyle w:val="VerbatimChar"/>
-        </w:rPr>
-        <w:t xml:space="preserve">  subgraph External["Third parties / partners"]</w:t>
-      </w:r>
-      <w:r>
-        <w:br/>
-      </w:r>
-      <w:r>
-        <w:rPr>
-          <w:rStyle w:val="VerbatimChar"/>
-        </w:rPr>
-        <w:t xml:space="preserve">    ELLO["Ello / Getello Voice AI\n'Ruby' (processor)\nx-api-key over WSS"]</w:t>
-      </w:r>
-      <w:r>
-        <w:br/>
-      </w:r>
-      <w:r>
-        <w:rPr>
-          <w:rStyle w:val="VerbatimChar"/>
-        </w:rPr>
-        <w:t xml:space="preserve">    LEND["RBI-regulated Lenders\n(offers, handoff, disbursal)"]</w:t>
-      </w:r>
-      <w:r>
-        <w:br/>
-      </w:r>
-      <w:r>
-        <w:rPr>
-          <w:rStyle w:val="VerbatimChar"/>
-        </w:rPr>
-        <w:t xml:space="preserve">    BUREAU["Credit Bureaus\nCIBIL / CRIF (CICRA soft-pull)"]</w:t>
-      </w:r>
-      <w:r>
-        <w:br/>
-      </w:r>
-      <w:r>
-        <w:rPr>
-          <w:rStyle w:val="VerbatimChar"/>
-        </w:rPr>
-        <w:t xml:space="preserve">    SMS["SMS / OTP provider"]</w:t>
-      </w:r>
-      <w:r>
-        <w:br/>
-      </w:r>
-      <w:r>
-        <w:rPr>
-          <w:rStyle w:val="VerbatimChar"/>
-        </w:rPr>
-        <w:t xml:space="preserve">  end</w:t>
-      </w:r>
-      <w:r>
-        <w:br/>
-      </w:r>
-      <w:r>
-        <w:br/>
-      </w:r>
-      <w:r>
-        <w:rPr>
-          <w:rStyle w:val="VerbatimChar"/>
-        </w:rPr>
-        <w:t xml:space="preserve">  RN --&gt;|"HTTPS JWT (B1)\nPII incl. PAN today"| API</w:t>
-      </w:r>
-      <w:r>
-        <w:br/>
-      </w:r>
-      <w:r>
-        <w:rPr>
-          <w:rStyle w:val="VerbatimChar"/>
-        </w:rPr>
-        <w:t xml:space="preserve">  WEB --&gt;|"HTTPS lead capture (B1)"| API</w:t>
-      </w:r>
-      <w:r>
-        <w:br/>
-      </w:r>
-      <w:r>
-        <w:rPr>
-          <w:rStyle w:val="VerbatimChar"/>
-        </w:rPr>
-        <w:t xml:space="preserve">  ADMIN --&gt;|"HTTPS Bearer, token in localStorage (B3)"| API</w:t>
-      </w:r>
-      <w:r>
-        <w:br/>
-      </w:r>
-      <w:r>
-        <w:rPr>
-          <w:rStyle w:val="VerbatimChar"/>
-        </w:rPr>
-        <w:t xml:space="preserve">  API --&gt; DB</w:t>
-      </w:r>
-      <w:r>
-        <w:br/>
-      </w:r>
-      <w:r>
-        <w:rPr>
-          <w:rStyle w:val="VerbatimChar"/>
-        </w:rPr>
-        <w:t xml:space="preserve">  API --&gt;|OTP send| SMS</w:t>
-      </w:r>
-      <w:r>
-        <w:br/>
-      </w:r>
-      <w:r>
-        <w:rPr>
-          <w:rStyle w:val="VerbatimChar"/>
-        </w:rPr>
-        <w:t xml:space="preserve">  API --&gt;|"server-to-server\nconsent-gated (target)"| LEND</w:t>
-      </w:r>
-      <w:r>
-        <w:br/>
-      </w:r>
-      <w:r>
-        <w:rPr>
-          <w:rStyle w:val="VerbatimChar"/>
-        </w:rPr>
-        <w:t xml:space="preserve">  API --&gt;|"soft enquiry (CICRA)"| BUREAU</w:t>
-      </w:r>
-      <w:r>
-        <w:br/>
-      </w:r>
-      <w:r>
-        <w:rPr>
-          <w:rStyle w:val="VerbatimChar"/>
-        </w:rPr>
-        <w:t xml:space="preserve">  RN -.-&gt;|"ws:// + live field values incl. PAN (B2, gaps C2/C13)"| ELLO</w:t>
-      </w:r>
-      <w:r>
-        <w:br/>
-      </w:r>
-      <w:r>
-        <w:rPr>
-          <w:rStyle w:val="VerbatimChar"/>
-        </w:rPr>
-        <w:t xml:space="preserve">  WEB -.-&gt;|"voice lead / context session"| ELLO</w:t>
-      </w:r>
-      <w:r>
-        <w:br/>
-      </w:r>
-      <w:r>
-        <w:rPr>
-          <w:rStyle w:val="VerbatimChar"/>
-        </w:rPr>
-        <w:t xml:space="preserve">  ADMIN -.-&gt;|"voice navigation widget"| ELLO</w:t>
-      </w:r>
-      <w:r>
-        <w:br/>
-      </w:r>
-      <w:r>
-        <w:br/>
-      </w:r>
-      <w:r>
-        <w:rPr>
-          <w:rStyle w:val="VerbatimChar"/>
-        </w:rPr>
-        <w:t xml:space="preserve">  classDef gap stroke:#c0392b,stroke-width:2px,stroke-dasharray:4 3;</w:t>
-      </w:r>
-      <w:r>
-        <w:br/>
-      </w:r>
-      <w:r>
-        <w:rPr>
-          <w:rStyle w:val="VerbatimChar"/>
-        </w:rPr>
-        <w:t xml:space="preserve">  class ELLO gap;</w:t>
+        <w:pStyle w:val="CaptionedFigure"/>
+      </w:pPr>
+      <w:r>
+        <w:drawing>
+          <wp:inline>
+            <wp:extent cx="5334000" cy="1707696"/>
+            <wp:effectExtent b="0" l="0" r="0" t="0"/>
+            <wp:docPr descr="Figure 1 — System context and data flows" title="" id="22" name="Picture"/>
+            <a:graphic>
+              <a:graphicData uri="http://schemas.openxmlformats.org/drawingml/2006/picture">
+                <pic:pic>
+                  <pic:nvPicPr>
+                    <pic:cNvPr descr="diagrams/tad-fig1-system-context.png" id="23" name="Picture"/>
+                    <pic:cNvPicPr>
+                      <a:picLocks noChangeArrowheads="1" noChangeAspect="1"/>
+                    </pic:cNvPicPr>
+                  </pic:nvPicPr>
+                  <pic:blipFill>
+                    <a:blip r:embed="rId21"/>
+                    <a:stretch>
+                      <a:fillRect/>
+                    </a:stretch>
+                  </pic:blipFill>
+                  <pic:spPr bwMode="auto">
+                    <a:xfrm>
+                      <a:off x="0" y="0"/>
+                      <a:ext cx="5334000" cy="1707696"/>
+                    </a:xfrm>
+                    <a:prstGeom prst="rect">
+                      <a:avLst/>
+                    </a:prstGeom>
+                    <a:noFill/>
+                    <a:ln w="9525">
+                      <a:noFill/>
+                      <a:headEnd/>
+                      <a:tailEnd/>
+                    </a:ln>
+                  </pic:spPr>
+                </pic:pic>
+              </a:graphicData>
+            </a:graphic>
+          </wp:inline>
+        </w:drawing>
+      </w:r>
+    </w:p>
+    <w:p>
+      <w:pPr>
+        <w:pStyle w:val="ImageCaption"/>
+      </w:pPr>
+      <w:r>
+        <w:t xml:space="preserve">Figure 1 — System context and data flows</w:t>
+      </w:r>
+    </w:p>
+    <w:p>
+      <w:pPr>
+        <w:pStyle w:val="BodyText"/>
+      </w:pPr>
+      <w:r>
+        <w:rPr>
+          <w:i/>
+          <w:iCs/>
+        </w:rPr>
+        <w:t xml:space="preserve">Figure rendered to a real image; editable source:</w:t>
+      </w:r>
+      <w:r>
+        <w:rPr>
+          <w:i/>
+          <w:iCs/>
+        </w:rPr>
+        <w:t xml:space="preserve"> </w:t>
+      </w:r>
+      <w:r>
+        <w:rPr>
+          <w:rStyle w:val="VerbatimChar"/>
+          <w:i/>
+          <w:iCs/>
+        </w:rPr>
+        <w:t xml:space="preserve">docs/compliance/diagrams/tad-fig1-system-context.mmd</w:t>
+      </w:r>
+      <w:r>
+        <w:rPr>
+          <w:i/>
+          <w:iCs/>
+        </w:rPr>
+        <w:t xml:space="preserve">.</w:t>
       </w:r>
     </w:p>
     <w:p>
@@ -2673,9 +2496,9 @@
         </w:pict>
       </w:r>
     </w:p>
-    <w:bookmarkEnd w:id="21"/>
-    <w:bookmarkEnd w:id="22"/>
-    <w:bookmarkStart w:id="23" w:name="technology-stack"/>
+    <w:bookmarkEnd w:id="24"/>
+    <w:bookmarkEnd w:id="25"/>
+    <w:bookmarkStart w:id="26" w:name="technology-stack"/>
     <w:p>
       <w:pPr>
         <w:pStyle w:val="Heading2"/>
@@ -3430,8 +3253,8 @@
         </w:pict>
       </w:r>
     </w:p>
-    <w:bookmarkEnd w:id="23"/>
-    <w:bookmarkStart w:id="28" w:name="application-architecture"/>
+    <w:bookmarkEnd w:id="26"/>
+    <w:bookmarkStart w:id="31" w:name="application-architecture"/>
     <w:p>
       <w:pPr>
         <w:pStyle w:val="Heading2"/>
@@ -3440,7 +3263,7 @@
         <w:t xml:space="preserve">5. Application architecture</w:t>
       </w:r>
     </w:p>
-    <w:bookmarkStart w:id="24" w:name="mobile-app"/>
+    <w:bookmarkStart w:id="27" w:name="mobile-app"/>
     <w:p>
       <w:pPr>
         <w:pStyle w:val="Heading3"/>
@@ -4348,8 +4171,8 @@
         <w:t xml:space="preserve">) — gap C2.</w:t>
       </w:r>
     </w:p>
-    <w:bookmarkEnd w:id="24"/>
-    <w:bookmarkStart w:id="25" w:name="backend-api"/>
+    <w:bookmarkEnd w:id="27"/>
+    <w:bookmarkStart w:id="28" w:name="backend-api"/>
     <w:p>
       <w:pPr>
         <w:pStyle w:val="Heading3"/>
@@ -4798,8 +4621,8 @@
         <w:t xml:space="preserve">screens are currently non-functional demo stubs).</w:t>
       </w:r>
     </w:p>
-    <w:bookmarkEnd w:id="25"/>
-    <w:bookmarkStart w:id="26" w:name="admin-dashboard"/>
+    <w:bookmarkEnd w:id="28"/>
+    <w:bookmarkStart w:id="29" w:name="admin-dashboard"/>
     <w:p>
       <w:pPr>
         <w:pStyle w:val="Heading3"/>
@@ -4945,8 +4768,8 @@
         <w:t xml:space="preserve">env-gated.</w:t>
       </w:r>
     </w:p>
-    <w:bookmarkEnd w:id="26"/>
-    <w:bookmarkStart w:id="27" w:name="authentication-model"/>
+    <w:bookmarkEnd w:id="29"/>
+    <w:bookmarkStart w:id="30" w:name="authentication-model"/>
     <w:p>
       <w:pPr>
         <w:pStyle w:val="Heading3"/>
@@ -5568,9 +5391,9 @@
         </w:pict>
       </w:r>
     </w:p>
-    <w:bookmarkEnd w:id="27"/>
-    <w:bookmarkEnd w:id="28"/>
-    <w:bookmarkStart w:id="33" w:name="data-architecture"/>
+    <w:bookmarkEnd w:id="30"/>
+    <w:bookmarkEnd w:id="31"/>
+    <w:bookmarkStart w:id="36" w:name="data-architecture"/>
     <w:p>
       <w:pPr>
         <w:pStyle w:val="Heading2"/>
@@ -5579,7 +5402,7 @@
         <w:t xml:space="preserve">6. Data architecture</w:t>
       </w:r>
     </w:p>
-    <w:bookmarkStart w:id="29" w:name="prisma-data-model-system-of-record"/>
+    <w:bookmarkStart w:id="32" w:name="prisma-data-model-system-of-record"/>
     <w:p>
       <w:pPr>
         <w:pStyle w:val="Heading3"/>
@@ -6066,8 +5889,8 @@
         <w:t xml:space="preserve">(opaque-token deep-link context carry).</w:t>
       </w:r>
     </w:p>
-    <w:bookmarkEnd w:id="29"/>
-    <w:bookmarkStart w:id="30" w:name="pii-data-model-and-classification"/>
+    <w:bookmarkEnd w:id="32"/>
+    <w:bookmarkStart w:id="33" w:name="pii-data-model-and-classification"/>
     <w:p>
       <w:pPr>
         <w:pStyle w:val="Heading3"/>
@@ -7204,8 +7027,8 @@
         </w:tc>
       </w:tr>
     </w:tbl>
-    <w:bookmarkEnd w:id="30"/>
-    <w:bookmarkStart w:id="31" w:name="data-at-rest-posture"/>
+    <w:bookmarkEnd w:id="33"/>
+    <w:bookmarkStart w:id="34" w:name="data-at-rest-posture"/>
     <w:p>
       <w:pPr>
         <w:pStyle w:val="Heading3"/>
@@ -7403,8 +7226,8 @@
         <w:t xml:space="preserve">; masking on read for all SPDI fields (A.8.11).</w:t>
       </w:r>
     </w:p>
-    <w:bookmarkEnd w:id="31"/>
-    <w:bookmarkStart w:id="32" w:name="data-lifecycle"/>
+    <w:bookmarkEnd w:id="34"/>
+    <w:bookmarkStart w:id="35" w:name="data-lifecycle"/>
     <w:p>
       <w:pPr>
         <w:pStyle w:val="Heading3"/>
@@ -7602,9 +7425,9 @@
         </w:pict>
       </w:r>
     </w:p>
-    <w:bookmarkEnd w:id="32"/>
-    <w:bookmarkEnd w:id="33"/>
-    <w:bookmarkStart w:id="39" w:name="integration-architecture"/>
+    <w:bookmarkEnd w:id="35"/>
+    <w:bookmarkEnd w:id="36"/>
+    <w:bookmarkStart w:id="45" w:name="integration-architecture"/>
     <w:p>
       <w:pPr>
         <w:pStyle w:val="Heading2"/>
@@ -7613,7 +7436,7 @@
         <w:t xml:space="preserve">7. Integration architecture</w:t>
       </w:r>
     </w:p>
-    <w:bookmarkStart w:id="34" w:name="ello-voice-ai-ruby-third-party-processor"/>
+    <w:bookmarkStart w:id="37" w:name="ello-voice-ai-ruby-third-party-processor"/>
     <w:p>
       <w:pPr>
         <w:pStyle w:val="Heading3"/>
@@ -7963,8 +7786,8 @@
         <w:t xml:space="preserve">with Ello.</w:t>
       </w:r>
     </w:p>
-    <w:bookmarkEnd w:id="34"/>
-    <w:bookmarkStart w:id="35" w:name="lending-partners-handoff-soft-pull"/>
+    <w:bookmarkEnd w:id="37"/>
+    <w:bookmarkStart w:id="38" w:name="lending-partners-handoff-soft-pull"/>
     <w:p>
       <w:pPr>
         <w:pStyle w:val="Heading3"/>
@@ -8072,8 +7895,8 @@
         <w:t xml:space="preserve">lender.</w:t>
       </w:r>
     </w:p>
-    <w:bookmarkEnd w:id="35"/>
-    <w:bookmarkStart w:id="36" w:name="credit-bureaus-cicra-soft-pull"/>
+    <w:bookmarkEnd w:id="38"/>
+    <w:bookmarkStart w:id="39" w:name="credit-bureaus-cicra-soft-pull"/>
     <w:p>
       <w:pPr>
         <w:pStyle w:val="Heading3"/>
@@ -8142,8 +7965,8 @@
         <w:t xml:space="preserve">before the pull.</w:t>
       </w:r>
     </w:p>
-    <w:bookmarkEnd w:id="36"/>
-    <w:bookmarkStart w:id="37" w:name="Xfeb917eb34449d232e619adde9b0f00a05ecc36"/>
+    <w:bookmarkEnd w:id="39"/>
+    <w:bookmarkStart w:id="40" w:name="Xfeb917eb34449d232e619adde9b0f00a05ecc36"/>
     <w:p>
       <w:pPr>
         <w:pStyle w:val="Heading3"/>
@@ -8254,8 +8077,8 @@
         <w:t xml:space="preserve">currently never purged (gap C9).</w:t>
       </w:r>
     </w:p>
-    <w:bookmarkEnd w:id="37"/>
-    <w:bookmarkStart w:id="38" w:name="sequence-diagram-otp-login-flow"/>
+    <w:bookmarkEnd w:id="40"/>
+    <w:bookmarkStart w:id="44" w:name="sequence-diagram-otp-login-flow"/>
     <w:p>
       <w:pPr>
         <w:pStyle w:val="Heading3"/>
@@ -8266,187 +8089,91 @@
     </w:p>
     <w:p>
       <w:pPr>
-        <w:pStyle w:val="SourceCode"/>
-      </w:pPr>
-      <w:r>
-        <w:rPr>
-          <w:rStyle w:val="VerbatimChar"/>
-        </w:rPr>
-        <w:t xml:space="preserve">sequenceDiagram</w:t>
-      </w:r>
-      <w:r>
-        <w:br/>
-      </w:r>
-      <w:r>
-        <w:rPr>
-          <w:rStyle w:val="VerbatimChar"/>
-        </w:rPr>
-        <w:t xml:space="preserve">  actor U as User</w:t>
-      </w:r>
-      <w:r>
-        <w:br/>
-      </w:r>
-      <w:r>
-        <w:rPr>
-          <w:rStyle w:val="VerbatimChar"/>
-        </w:rPr>
-        <w:t xml:space="preserve">  participant RN as RN App (client.ts)</w:t>
-      </w:r>
-      <w:r>
-        <w:br/>
-      </w:r>
-      <w:r>
-        <w:rPr>
-          <w:rStyle w:val="VerbatimChar"/>
-        </w:rPr>
-        <w:t xml:space="preserve">  participant API as Backend API (auth.routes)</w:t>
-      </w:r>
-      <w:r>
-        <w:br/>
-      </w:r>
-      <w:r>
-        <w:rPr>
-          <w:rStyle w:val="VerbatimChar"/>
-        </w:rPr>
-        <w:t xml:space="preserve">  participant DB as PostgreSQL</w:t>
-      </w:r>
-      <w:r>
-        <w:br/>
-      </w:r>
-      <w:r>
-        <w:rPr>
-          <w:rStyle w:val="VerbatimChar"/>
-        </w:rPr>
-        <w:t xml:space="preserve">  participant SMS as SMS provider</w:t>
-      </w:r>
-      <w:r>
-        <w:br/>
-      </w:r>
-      <w:r>
-        <w:br/>
-      </w:r>
-      <w:r>
-        <w:rPr>
-          <w:rStyle w:val="VerbatimChar"/>
-        </w:rPr>
-        <w:t xml:space="preserve">  U-&gt;&gt;RN: Enter phone, tap "Send OTP"</w:t>
-      </w:r>
-      <w:r>
-        <w:br/>
-      </w:r>
-      <w:r>
-        <w:rPr>
-          <w:rStyle w:val="VerbatimChar"/>
-        </w:rPr>
-        <w:t xml:space="preserve">  RN-&gt;&gt;API: POST /api/auth/otp/request { phone }</w:t>
-      </w:r>
-      <w:r>
-        <w:br/>
-      </w:r>
-      <w:r>
-        <w:rPr>
-          <w:rStyle w:val="VerbatimChar"/>
-        </w:rPr>
-        <w:t xml:space="preserve">  API-&gt;&gt;DB: upsert User(phone); create OtpToken(codeHash=SHA256(otp))</w:t>
-      </w:r>
-      <w:r>
-        <w:br/>
-      </w:r>
-      <w:r>
-        <w:rPr>
-          <w:rStyle w:val="VerbatimChar"/>
-        </w:rPr>
-        <w:t xml:space="preserve">  API-&gt;&gt;SMS: send OTP (prod) — dev/DEMO returns devOtp</w:t>
-      </w:r>
-      <w:r>
-        <w:br/>
-      </w:r>
-      <w:r>
-        <w:rPr>
-          <w:rStyle w:val="VerbatimChar"/>
-        </w:rPr>
-        <w:t xml:space="preserve">  API--&gt;&gt;RN: { otpSent: true, devOtp? }</w:t>
-      </w:r>
-      <w:r>
-        <w:br/>
-      </w:r>
-      <w:r>
-        <w:rPr>
-          <w:rStyle w:val="VerbatimChar"/>
-        </w:rPr>
-        <w:t xml:space="preserve">  Note over RN,API: Gap C3 — fixed OTP 123456 accepted in prod path</w:t>
-      </w:r>
-      <w:r>
-        <w:br/>
-      </w:r>
-      <w:r>
-        <w:rPr>
-          <w:rStyle w:val="VerbatimChar"/>
-        </w:rPr>
-        <w:t xml:space="preserve">  U-&gt;&gt;RN: Enter OTP code</w:t>
-      </w:r>
-      <w:r>
-        <w:br/>
-      </w:r>
-      <w:r>
-        <w:rPr>
-          <w:rStyle w:val="VerbatimChar"/>
-        </w:rPr>
-        <w:t xml:space="preserve">  RN-&gt;&gt;API: POST /api/auth/otp/verify { phone, code }</w:t>
-      </w:r>
-      <w:r>
-        <w:br/>
-      </w:r>
-      <w:r>
-        <w:rPr>
-          <w:rStyle w:val="VerbatimChar"/>
-        </w:rPr>
-        <w:t xml:space="preserve">  API-&gt;&gt;DB: find unconsumed OtpToken; compare SHA256(code)</w:t>
-      </w:r>
-      <w:r>
-        <w:br/>
-      </w:r>
-      <w:r>
-        <w:rPr>
-          <w:rStyle w:val="VerbatimChar"/>
-        </w:rPr>
-        <w:t xml:space="preserve">  API-&gt;&gt;DB: mark consumed; set phoneVerified=true</w:t>
-      </w:r>
-      <w:r>
-        <w:br/>
-      </w:r>
-      <w:r>
-        <w:rPr>
-          <w:rStyle w:val="VerbatimChar"/>
-        </w:rPr>
-        <w:t xml:space="preserve">  API-&gt;&gt;DB: create RefreshToken(tokenHash=SHA256(refresh))</w:t>
-      </w:r>
-      <w:r>
-        <w:br/>
-      </w:r>
-      <w:r>
-        <w:rPr>
-          <w:rStyle w:val="VerbatimChar"/>
-        </w:rPr>
-        <w:t xml:space="preserve">  API--&gt;&gt;RN: { user, accessToken(JWT,900s), refreshToken }</w:t>
-      </w:r>
-      <w:r>
-        <w:br/>
-      </w:r>
-      <w:r>
-        <w:rPr>
-          <w:rStyle w:val="VerbatimChar"/>
-        </w:rPr>
-        <w:t xml:space="preserve">  RN-&gt;&gt;RN: setTokens(access, refresh) — in-memory</w:t>
-      </w:r>
-      <w:r>
-        <w:br/>
-      </w:r>
-      <w:r>
-        <w:rPr>
-          <w:rStyle w:val="VerbatimChar"/>
-        </w:rPr>
-        <w:t xml:space="preserve">  Note over RN: Access token attached as Bearer on subsequent calls</w:t>
+        <w:pStyle w:val="CaptionedFigure"/>
+      </w:pPr>
+      <w:r>
+        <w:drawing>
+          <wp:inline>
+            <wp:extent cx="5334000" cy="2816678"/>
+            <wp:effectExtent b="0" l="0" r="0" t="0"/>
+            <wp:docPr descr="Figure 2 — OTP login sequence" title="" id="42" name="Picture"/>
+            <a:graphic>
+              <a:graphicData uri="http://schemas.openxmlformats.org/drawingml/2006/picture">
+                <pic:pic>
+                  <pic:nvPicPr>
+                    <pic:cNvPr descr="diagrams/tad-fig2-otp-sequence.png" id="43" name="Picture"/>
+                    <pic:cNvPicPr>
+                      <a:picLocks noChangeArrowheads="1" noChangeAspect="1"/>
+                    </pic:cNvPicPr>
+                  </pic:nvPicPr>
+                  <pic:blipFill>
+                    <a:blip r:embed="rId41"/>
+                    <a:stretch>
+                      <a:fillRect/>
+                    </a:stretch>
+                  </pic:blipFill>
+                  <pic:spPr bwMode="auto">
+                    <a:xfrm>
+                      <a:off x="0" y="0"/>
+                      <a:ext cx="5334000" cy="2816678"/>
+                    </a:xfrm>
+                    <a:prstGeom prst="rect">
+                      <a:avLst/>
+                    </a:prstGeom>
+                    <a:noFill/>
+                    <a:ln w="9525">
+                      <a:noFill/>
+                      <a:headEnd/>
+                      <a:tailEnd/>
+                    </a:ln>
+                  </pic:spPr>
+                </pic:pic>
+              </a:graphicData>
+            </a:graphic>
+          </wp:inline>
+        </w:drawing>
+      </w:r>
+    </w:p>
+    <w:p>
+      <w:pPr>
+        <w:pStyle w:val="ImageCaption"/>
+      </w:pPr>
+      <w:r>
+        <w:t xml:space="preserve">Figure 2 — OTP login sequence</w:t>
+      </w:r>
+    </w:p>
+    <w:p>
+      <w:pPr>
+        <w:pStyle w:val="BodyText"/>
+      </w:pPr>
+      <w:r>
+        <w:rPr>
+          <w:i/>
+          <w:iCs/>
+        </w:rPr>
+        <w:t xml:space="preserve">Figure rendered to a real image; editable source:</w:t>
+      </w:r>
+      <w:r>
+        <w:rPr>
+          <w:i/>
+          <w:iCs/>
+        </w:rPr>
+        <w:t xml:space="preserve"> </w:t>
+      </w:r>
+      <w:r>
+        <w:rPr>
+          <w:rStyle w:val="VerbatimChar"/>
+          <w:i/>
+          <w:iCs/>
+        </w:rPr>
+        <w:t xml:space="preserve">docs/compliance/diagrams/tad-fig2-otp-sequence.mmd</w:t>
+      </w:r>
+      <w:r>
+        <w:rPr>
+          <w:i/>
+          <w:iCs/>
+        </w:rPr>
+        <w:t xml:space="preserve">.</w:t>
       </w:r>
     </w:p>
     <w:p>
@@ -8456,9 +8183,9 @@
         </w:pict>
       </w:r>
     </w:p>
-    <w:bookmarkEnd w:id="38"/>
-    <w:bookmarkEnd w:id="39"/>
-    <w:bookmarkStart w:id="51" w:name="security-architecture"/>
+    <w:bookmarkEnd w:id="44"/>
+    <w:bookmarkEnd w:id="45"/>
+    <w:bookmarkStart w:id="57" w:name="security-architecture"/>
     <w:p>
       <w:pPr>
         <w:pStyle w:val="Heading2"/>
@@ -8557,7 +8284,7 @@
         <w:t xml:space="preserve">(see §8.10).</w:t>
       </w:r>
     </w:p>
-    <w:bookmarkStart w:id="40" w:name="X29be1470e0b29fe60566f5a7ddfffd60723fc3e"/>
+    <w:bookmarkStart w:id="46" w:name="X29be1470e0b29fe60566f5a7ddfffd60723fc3e"/>
     <w:p>
       <w:pPr>
         <w:pStyle w:val="Heading3"/>
@@ -8760,8 +8487,8 @@
         <w:t xml:space="preserve">enforce MFA; account/OTP rate limiting and lockout.</w:t>
       </w:r>
     </w:p>
-    <w:bookmarkEnd w:id="40"/>
-    <w:bookmarkStart w:id="41" w:name="Xa204b52a0ea3ea827e36ff98d2953063a7a5da2"/>
+    <w:bookmarkEnd w:id="46"/>
+    <w:bookmarkStart w:id="47" w:name="Xa204b52a0ea3ea827e36ff98d2953063a7a5da2"/>
     <w:p>
       <w:pPr>
         <w:pStyle w:val="Heading3"/>
@@ -8974,8 +8701,8 @@
         <w:t xml:space="preserve">.</w:t>
       </w:r>
     </w:p>
-    <w:bookmarkEnd w:id="41"/>
-    <w:bookmarkStart w:id="42" w:name="Xe34cbcc50d329b9c00139bf47ef281eedc68913"/>
+    <w:bookmarkEnd w:id="47"/>
+    <w:bookmarkStart w:id="48" w:name="Xe34cbcc50d329b9c00139bf47ef281eedc68913"/>
     <w:p>
       <w:pPr>
         <w:pStyle w:val="Heading3"/>
@@ -9151,8 +8878,8 @@
         <w:t xml:space="preserve">on boundary B2.</w:t>
       </w:r>
     </w:p>
-    <w:bookmarkEnd w:id="42"/>
-    <w:bookmarkStart w:id="43" w:name="X4a3c7e04670b6663327d61a350e4e646d967d6b"/>
+    <w:bookmarkEnd w:id="48"/>
+    <w:bookmarkStart w:id="49" w:name="X4a3c7e04670b6663327d61a350e4e646d967d6b"/>
     <w:p>
       <w:pPr>
         <w:pStyle w:val="Heading3"/>
@@ -9409,8 +9136,8 @@
         <w:t xml:space="preserve">client bundles.</w:t>
       </w:r>
     </w:p>
-    <w:bookmarkEnd w:id="43"/>
-    <w:bookmarkStart w:id="44" w:name="X4f46d62e894c1f334a1f4741bc5b56064e0d402"/>
+    <w:bookmarkEnd w:id="49"/>
+    <w:bookmarkStart w:id="50" w:name="X4f46d62e894c1f334a1f4741bc5b56064e0d402"/>
     <w:p>
       <w:pPr>
         <w:pStyle w:val="Heading3"/>
@@ -9595,8 +9322,8 @@
         <w:t xml:space="preserve">and a WAF in front of the API and admin services.</w:t>
       </w:r>
     </w:p>
-    <w:bookmarkEnd w:id="44"/>
-    <w:bookmarkStart w:id="45" w:name="Xa017329efbb99268247cfd3244d0e18312dfbcd"/>
+    <w:bookmarkEnd w:id="50"/>
+    <w:bookmarkStart w:id="51" w:name="Xa017329efbb99268247cfd3244d0e18312dfbcd"/>
     <w:p>
       <w:pPr>
         <w:pStyle w:val="Heading3"/>
@@ -9847,8 +9574,8 @@
         <w:t xml:space="preserve">certificates where feasible.</w:t>
       </w:r>
     </w:p>
-    <w:bookmarkEnd w:id="45"/>
-    <w:bookmarkStart w:id="46" w:name="Xe400b0fa57b96837151da41447803aafa1f71c0"/>
+    <w:bookmarkEnd w:id="51"/>
+    <w:bookmarkStart w:id="52" w:name="Xe400b0fa57b96837151da41447803aafa1f71c0"/>
     <w:p>
       <w:pPr>
         <w:pStyle w:val="Heading3"/>
@@ -10037,8 +9764,8 @@
         <w:t xml:space="preserve">on-screen masking for SPDI fields.</w:t>
       </w:r>
     </w:p>
-    <w:bookmarkEnd w:id="46"/>
-    <w:bookmarkStart w:id="47" w:name="Xca3912937c68f51ca1578b4a8e05a2e4181a81d"/>
+    <w:bookmarkEnd w:id="52"/>
+    <w:bookmarkStart w:id="53" w:name="Xca3912937c68f51ca1578b4a8e05a2e4181a81d"/>
     <w:p>
       <w:pPr>
         <w:pStyle w:val="Heading3"/>
@@ -10244,8 +9971,8 @@
         <w:t xml:space="preserve">per CERT-In 2022.</w:t>
       </w:r>
     </w:p>
-    <w:bookmarkEnd w:id="47"/>
-    <w:bookmarkStart w:id="48" w:name="X3b030a9dd950d7714a6c08882c75113348f0950"/>
+    <w:bookmarkEnd w:id="53"/>
+    <w:bookmarkStart w:id="54" w:name="X3b030a9dd950d7714a6c08882c75113348f0950"/>
     <w:p>
       <w:pPr>
         <w:pStyle w:val="Heading3"/>
@@ -10423,8 +10150,8 @@
         <w:t xml:space="preserve">redact SPDI from voice/page_context and from logs.</w:t>
       </w:r>
     </w:p>
-    <w:bookmarkEnd w:id="48"/>
-    <w:bookmarkStart w:id="49" w:name="additional-soc-2-specific-control-areas"/>
+    <w:bookmarkEnd w:id="54"/>
+    <w:bookmarkStart w:id="55" w:name="additional-soc-2-specific-control-areas"/>
     <w:p>
       <w:pPr>
         <w:pStyle w:val="Heading3"/>
@@ -11229,8 +10956,8 @@
         <w:t xml:space="preserve">before a Type II examination can commence.</w:t>
       </w:r>
     </w:p>
-    <w:bookmarkEnd w:id="49"/>
-    <w:bookmarkStart w:id="50" w:name="X9210ad85e4d436d90b48cf95b3b76092ee55f89"/>
+    <w:bookmarkEnd w:id="55"/>
+    <w:bookmarkStart w:id="56" w:name="X9210ad85e4d436d90b48cf95b3b76092ee55f89"/>
     <w:p>
       <w:pPr>
         <w:pStyle w:val="Heading3"/>
@@ -12052,9 +11779,9 @@
         </w:pict>
       </w:r>
     </w:p>
-    <w:bookmarkEnd w:id="50"/>
-    <w:bookmarkEnd w:id="51"/>
-    <w:bookmarkStart w:id="56" w:name="Xf450f8d635513aefc93a4b540b6b9cb6b6b91fa"/>
+    <w:bookmarkEnd w:id="56"/>
+    <w:bookmarkEnd w:id="57"/>
+    <w:bookmarkStart w:id="62" w:name="Xf450f8d635513aefc93a4b540b6b9cb6b6b91fa"/>
     <w:p>
       <w:pPr>
         <w:pStyle w:val="Heading2"/>
@@ -12063,7 +11790,7 @@
         <w:t xml:space="preserve">9. Deployment and infrastructure architecture</w:t>
       </w:r>
     </w:p>
-    <w:bookmarkStart w:id="52" w:name="hosting-render-blueprint"/>
+    <w:bookmarkStart w:id="58" w:name="hosting-render-blueprint"/>
     <w:p>
       <w:pPr>
         <w:pStyle w:val="Heading3"/>
@@ -12233,8 +11960,8 @@
         <w:t xml:space="preserve">the Render UI.</w:t>
       </w:r>
     </w:p>
-    <w:bookmarkEnd w:id="52"/>
-    <w:bookmarkStart w:id="53" w:name="environments"/>
+    <w:bookmarkEnd w:id="58"/>
+    <w:bookmarkStart w:id="59" w:name="environments"/>
     <w:p>
       <w:pPr>
         <w:pStyle w:val="Heading3"/>
@@ -12332,8 +12059,8 @@
         <w:t xml:space="preserve">this must be removed for a real launch (C3).</w:t>
       </w:r>
     </w:p>
-    <w:bookmarkEnd w:id="53"/>
-    <w:bookmarkStart w:id="54" w:name="cicd-and-configuration"/>
+    <w:bookmarkEnd w:id="59"/>
+    <w:bookmarkStart w:id="60" w:name="cicd-and-configuration"/>
     <w:p>
       <w:pPr>
         <w:pStyle w:val="Heading3"/>
@@ -12485,8 +12212,8 @@
         <w:t xml:space="preserve">client-exposed by design — no server secret may ever be placed there.</w:t>
       </w:r>
     </w:p>
-    <w:bookmarkEnd w:id="54"/>
-    <w:bookmarkStart w:id="55" w:name="backups-residency-and-data-protection"/>
+    <w:bookmarkEnd w:id="60"/>
+    <w:bookmarkStart w:id="61" w:name="backups-residency-and-data-protection"/>
     <w:p>
       <w:pPr>
         <w:pStyle w:val="Heading3"/>
@@ -12612,9 +12339,9 @@
         </w:pict>
       </w:r>
     </w:p>
-    <w:bookmarkEnd w:id="55"/>
-    <w:bookmarkEnd w:id="56"/>
-    <w:bookmarkStart w:id="57" w:name="non-functional-architecture"/>
+    <w:bookmarkEnd w:id="61"/>
+    <w:bookmarkEnd w:id="62"/>
+    <w:bookmarkStart w:id="63" w:name="non-functional-architecture"/>
     <w:p>
       <w:pPr>
         <w:pStyle w:val="Heading2"/>
@@ -12903,8 +12630,8 @@
         </w:pict>
       </w:r>
     </w:p>
-    <w:bookmarkEnd w:id="57"/>
-    <w:bookmarkStart w:id="58" w:name="X83fef06dcd682ad1c5f2de84b78981579206522"/>
+    <w:bookmarkEnd w:id="63"/>
+    <w:bookmarkStart w:id="64" w:name="X83fef06dcd682ad1c5f2de84b78981579206522"/>
     <w:p>
       <w:pPr>
         <w:pStyle w:val="Heading2"/>
@@ -13863,8 +13590,8 @@
         </w:pict>
       </w:r>
     </w:p>
-    <w:bookmarkEnd w:id="58"/>
-    <w:bookmarkStart w:id="59" w:name="Xe7bb754be48efb71bdecf5ffcc0f517726aa48f"/>
+    <w:bookmarkEnd w:id="64"/>
+    <w:bookmarkStart w:id="65" w:name="Xe7bb754be48efb71bdecf5ffcc0f517726aa48f"/>
     <w:p>
       <w:pPr>
         <w:pStyle w:val="Heading2"/>
@@ -14888,8 +14615,8 @@
         <w:t xml:space="preserve">); do not distribute beyond the ISMS scope.</w:t>
       </w:r>
     </w:p>
-    <w:bookmarkEnd w:id="59"/>
-    <w:bookmarkEnd w:id="60"/>
+    <w:bookmarkEnd w:id="65"/>
+    <w:bookmarkEnd w:id="66"/>
     <w:sectPr>
       <w:footnotePr>
         <w:numRestart w:val="eachSect"/>

</xml_diff>

<commit_message>
Embed current + target architecture diagrams in TAD and Security docs
- Add rendered PNGs (2x) of the current as-built and recommended target
  architecture diagrams, with editable .svg sources, under docs/compliance/diagrams/.
- Embed both as Figures 3-4 in 02-Technical-Architecture-Document (§11
  current-vs-target) and as Figures A-B in 03-Security-and-Compliance-Document
  (§2.4a ISMS scope illustration).
- Regenerate both Word .docx so the images are embedded (word/media/).

Co-Authored-By: Claude Opus 4.8 <noreply@anthropic.com>
</commit_message>
<xml_diff>
--- a/docs/compliance/02-Technical-Architecture-Document.docx
+++ b/docs/compliance/02-Technical-Architecture-Document.docx
@@ -28,7 +28,7 @@
         </w:p>
       </w:sdtContent>
     </w:sdt>
-    <w:bookmarkStart w:id="66" w:name="Xa47d83bdace7056ef88396d24c9315bc986ffb5"/>
+    <w:bookmarkStart w:id="72" w:name="Xa47d83bdace7056ef88396d24c9315bc986ffb5"/>
     <w:p>
       <w:pPr>
         <w:pStyle w:val="Heading1"/>
@@ -12631,13 +12631,199 @@
       </w:r>
     </w:p>
     <w:bookmarkEnd w:id="63"/>
-    <w:bookmarkStart w:id="64" w:name="X83fef06dcd682ad1c5f2de84b78981579206522"/>
+    <w:bookmarkStart w:id="70" w:name="X83fef06dcd682ad1c5f2de84b78981579206522"/>
     <w:p>
       <w:pPr>
         <w:pStyle w:val="Heading2"/>
       </w:pPr>
       <w:r>
         <w:t xml:space="preserve">11. Current-state vs target-state architecture</w:t>
+      </w:r>
+    </w:p>
+    <w:p>
+      <w:pPr>
+        <w:pStyle w:val="FirstParagraph"/>
+      </w:pPr>
+      <w:r>
+        <w:t xml:space="preserve">The two views below summarise the platform’s</w:t>
+      </w:r>
+      <w:r>
+        <w:t xml:space="preserve"> </w:t>
+      </w:r>
+      <w:r>
+        <w:rPr>
+          <w:b/>
+          <w:bCs/>
+        </w:rPr>
+        <w:t xml:space="preserve">as-built</w:t>
+      </w:r>
+      <w:r>
+        <w:t xml:space="preserve"> </w:t>
+      </w:r>
+      <w:r>
+        <w:t xml:space="preserve">data-protection posture and the</w:t>
+      </w:r>
+      <w:r>
+        <w:t xml:space="preserve"> </w:t>
+      </w:r>
+      <w:r>
+        <w:rPr>
+          <w:b/>
+          <w:bCs/>
+        </w:rPr>
+        <w:t xml:space="preserve">recommended target</w:t>
+      </w:r>
+      <w:r>
+        <w:t xml:space="preserve"> </w:t>
+      </w:r>
+      <w:r>
+        <w:t xml:space="preserve">posture. The gap table that follows maps each verified concern (C1–C14) to the architectural change that closes it.</w:t>
+      </w:r>
+    </w:p>
+    <w:p>
+      <w:pPr>
+        <w:pStyle w:val="BodyText"/>
+      </w:pPr>
+      <w:r>
+        <w:rPr>
+          <w:b/>
+          <w:bCs/>
+        </w:rPr>
+        <w:t xml:space="preserve">Figure 3 — Current as-built architecture (data-protection view).</w:t>
+      </w:r>
+      <w:r>
+        <w:t xml:space="preserve"> </w:t>
+      </w:r>
+      <w:r>
+        <w:t xml:space="preserve">Red boxes/labels mark data-protection concerns.</w:t>
+      </w:r>
+    </w:p>
+    <w:p>
+      <w:pPr>
+        <w:pStyle w:val="CaptionedFigure"/>
+      </w:pPr>
+      <w:r>
+        <w:drawing>
+          <wp:inline>
+            <wp:extent cx="5334000" cy="3676135"/>
+            <wp:effectExtent b="0" l="0" r="0" t="0"/>
+            <wp:docPr descr="Figure 3 — SwiftLoan current as-built architecture" title="" id="65" name="Picture"/>
+            <a:graphic>
+              <a:graphicData uri="http://schemas.openxmlformats.org/drawingml/2006/picture">
+                <pic:pic>
+                  <pic:nvPicPr>
+                    <pic:cNvPr descr="diagrams/arch-current.png" id="66" name="Picture"/>
+                    <pic:cNvPicPr>
+                      <a:picLocks noChangeArrowheads="1" noChangeAspect="1"/>
+                    </pic:cNvPicPr>
+                  </pic:nvPicPr>
+                  <pic:blipFill>
+                    <a:blip r:embed="rId64"/>
+                    <a:stretch>
+                      <a:fillRect/>
+                    </a:stretch>
+                  </pic:blipFill>
+                  <pic:spPr bwMode="auto">
+                    <a:xfrm>
+                      <a:off x="0" y="0"/>
+                      <a:ext cx="5334000" cy="3676135"/>
+                    </a:xfrm>
+                    <a:prstGeom prst="rect">
+                      <a:avLst/>
+                    </a:prstGeom>
+                    <a:noFill/>
+                    <a:ln w="9525">
+                      <a:noFill/>
+                      <a:headEnd/>
+                      <a:tailEnd/>
+                    </a:ln>
+                  </pic:spPr>
+                </pic:pic>
+              </a:graphicData>
+            </a:graphic>
+          </wp:inline>
+        </w:drawing>
+      </w:r>
+    </w:p>
+    <w:p>
+      <w:pPr>
+        <w:pStyle w:val="ImageCaption"/>
+      </w:pPr>
+      <w:r>
+        <w:t xml:space="preserve">Figure 3 — SwiftLoan current as-built architecture</w:t>
+      </w:r>
+    </w:p>
+    <w:p>
+      <w:pPr>
+        <w:pStyle w:val="BodyText"/>
+      </w:pPr>
+      <w:r>
+        <w:rPr>
+          <w:b/>
+          <w:bCs/>
+        </w:rPr>
+        <w:t xml:space="preserve">Figure 4 — Recommended target architecture.</w:t>
+      </w:r>
+      <w:r>
+        <w:t xml:space="preserve"> </w:t>
+      </w:r>
+      <w:r>
+        <w:t xml:space="preserve">Green marks new/changed controls; blue tags indicate the ISO 27001:2022 / SOC 2 TSC / DPDP / RBI obligation each control satisfies, inside an India data-residency boundary.</w:t>
+      </w:r>
+    </w:p>
+    <w:p>
+      <w:pPr>
+        <w:pStyle w:val="CaptionedFigure"/>
+      </w:pPr>
+      <w:r>
+        <w:drawing>
+          <wp:inline>
+            <wp:extent cx="5334000" cy="3784256"/>
+            <wp:effectExtent b="0" l="0" r="0" t="0"/>
+            <wp:docPr descr="Figure 4 — SwiftLoan recommended target architecture" title="" id="68" name="Picture"/>
+            <a:graphic>
+              <a:graphicData uri="http://schemas.openxmlformats.org/drawingml/2006/picture">
+                <pic:pic>
+                  <pic:nvPicPr>
+                    <pic:cNvPr descr="diagrams/arch-recommended.png" id="69" name="Picture"/>
+                    <pic:cNvPicPr>
+                      <a:picLocks noChangeArrowheads="1" noChangeAspect="1"/>
+                    </pic:cNvPicPr>
+                  </pic:nvPicPr>
+                  <pic:blipFill>
+                    <a:blip r:embed="rId67"/>
+                    <a:stretch>
+                      <a:fillRect/>
+                    </a:stretch>
+                  </pic:blipFill>
+                  <pic:spPr bwMode="auto">
+                    <a:xfrm>
+                      <a:off x="0" y="0"/>
+                      <a:ext cx="5334000" cy="3784256"/>
+                    </a:xfrm>
+                    <a:prstGeom prst="rect">
+                      <a:avLst/>
+                    </a:prstGeom>
+                    <a:noFill/>
+                    <a:ln w="9525">
+                      <a:noFill/>
+                      <a:headEnd/>
+                      <a:tailEnd/>
+                    </a:ln>
+                  </pic:spPr>
+                </pic:pic>
+              </a:graphicData>
+            </a:graphic>
+          </wp:inline>
+        </w:drawing>
+      </w:r>
+    </w:p>
+    <w:p>
+      <w:pPr>
+        <w:pStyle w:val="ImageCaption"/>
+      </w:pPr>
+      <w:r>
+        <w:t xml:space="preserve">Figure 4 — SwiftLoan recommended target architecture</w:t>
       </w:r>
     </w:p>
     <w:tbl>
@@ -13590,8 +13776,8 @@
         </w:pict>
       </w:r>
     </w:p>
-    <w:bookmarkEnd w:id="64"/>
-    <w:bookmarkStart w:id="65" w:name="Xe7bb754be48efb71bdecf5ffcc0f517726aa48f"/>
+    <w:bookmarkEnd w:id="70"/>
+    <w:bookmarkStart w:id="71" w:name="Xe7bb754be48efb71bdecf5ffcc0f517726aa48f"/>
     <w:p>
       <w:pPr>
         <w:pStyle w:val="Heading2"/>
@@ -14615,8 +14801,8 @@
         <w:t xml:space="preserve">); do not distribute beyond the ISMS scope.</w:t>
       </w:r>
     </w:p>
-    <w:bookmarkEnd w:id="65"/>
-    <w:bookmarkEnd w:id="66"/>
+    <w:bookmarkEnd w:id="71"/>
+    <w:bookmarkEnd w:id="72"/>
     <w:sectPr>
       <w:footnotePr>
         <w:numRestart w:val="eachSect"/>

</xml_diff>